<commit_message>
ajustar el formato y contenido del PDF de inspección: modificar tamaño de fuente, ajustar posición de firma y mejorar espaciado
</commit_message>
<xml_diff>
--- a/plantillas/venta_contrato_vehiculo_PJ_NULO_v2.docx
+++ b/plantillas/venta_contrato_vehiculo_PJ_NULO_v2.docx
@@ -2019,15 +2019,34 @@
         <w:jc w:val="both"/>
         <w:rPr>
           <w:rFonts w:cstheme="minorHAnsi"/>
-          <w:b/>
-          <w:bCs/>
         </w:rPr>
       </w:pPr>
     </w:p>
     <w:p>
       <w:pPr>
-        <w:spacing w:before="240" w:line="240" w:lineRule="auto"/>
+        <w:pStyle w:val="Sinespaciado"/>
         <w:jc w:val="both"/>
+        <w:rPr>
+          <w:rFonts w:cstheme="minorHAnsi"/>
+        </w:rPr>
+      </w:pPr>
+    </w:p>
+    <w:p>
+      <w:pPr>
+        <w:pStyle w:val="Sinespaciado"/>
+        <w:jc w:val="both"/>
+        <w:rPr>
+          <w:rFonts w:cstheme="minorHAnsi"/>
+        </w:rPr>
+      </w:pPr>
+    </w:p>
+    <w:p>
+      <w:pPr>
+        <w:pStyle w:val="Sinespaciado"/>
+        <w:jc w:val="both"/>
+        <w:rPr>
+          <w:rFonts w:cstheme="minorHAnsi"/>
+        </w:rPr>
       </w:pPr>
     </w:p>
     <w:sectPr>

</xml_diff>

<commit_message>
Update vehicle sale contracts to change 'prima' to 'reserva' in multiple templates
</commit_message>
<xml_diff>
--- a/plantillas/venta_contrato_vehiculo_PJ_NULO_v2.docx
+++ b/plantillas/venta_contrato_vehiculo_PJ_NULO_v2.docx
@@ -1282,7 +1282,19 @@
         <w:rPr>
           <w:rFonts w:cstheme="minorHAnsi"/>
         </w:rPr>
-        <w:t xml:space="preserve">; en este acto el comprador deja en concepto de prima la cantidad de </w:t>
+        <w:t xml:space="preserve">; en este acto el comprador deja en concepto de </w:t>
+      </w:r>
+      <w:r>
+        <w:rPr>
+          <w:rFonts w:cstheme="minorHAnsi"/>
+        </w:rPr>
+        <w:t>reversa</w:t>
+      </w:r>
+      <w:r>
+        <w:rPr>
+          <w:rFonts w:cstheme="minorHAnsi"/>
+        </w:rPr>
+        <w:t xml:space="preserve"> la cantidad de </w:t>
       </w:r>
       <w:permStart w:id="929391793" w:edGrp="everyone"/>
       <w:r>
@@ -2248,28 +2260,6 @@
       </w:drawing>
     </w:r>
     <w:r>
-      <w:t>Código: RE-CS-0</w:t>
-    </w:r>
-    <w:r>
-      <w:t>9</w:t>
-    </w:r>
-  </w:p>
-  <w:p>
-    <w:pPr>
-      <w:pStyle w:val="Encabezado"/>
-    </w:pPr>
-    <w:r>
-      <w:t>Versión: 0</w:t>
-    </w:r>
-    <w:r>
-      <w:t>2</w:t>
-    </w:r>
-  </w:p>
-  <w:p>
-    <w:pPr>
-      <w:pStyle w:val="Encabezado"/>
-    </w:pPr>
-    <w:r>
       <w:rPr>
         <w:noProof/>
       </w:rPr>
@@ -2328,20 +2318,6 @@
           </wp14:sizeRelV>
         </wp:anchor>
       </w:drawing>
-    </w:r>
-    <w:r>
-      <w:t xml:space="preserve">Fecha: </w:t>
-    </w:r>
-    <w:r>
-      <w:t xml:space="preserve">28 de </w:t>
-    </w:r>
-    <w:proofErr w:type="gramStart"/>
-    <w:r>
-      <w:t>Febrero</w:t>
-    </w:r>
-    <w:proofErr w:type="gramEnd"/>
-    <w:r>
-      <w:t xml:space="preserve"> de 2026</w:t>
     </w:r>
   </w:p>
 </w:hdr>

</xml_diff>

<commit_message>
Refactor vehicle sale contract templates to improve clarity and consistency in terms and conditions
</commit_message>
<xml_diff>
--- a/plantillas/venta_contrato_vehiculo_PJ_NULO_v2.docx
+++ b/plantillas/venta_contrato_vehiculo_PJ_NULO_v2.docx
@@ -1642,7 +1642,13 @@
         <w:rPr>
           <w:rFonts w:cstheme="minorHAnsi"/>
         </w:rPr>
-        <w:t xml:space="preserve">: RESOLUCION DE CONFLICTOS cualquier controversia o reclamo que se origine del presente contrato o que se relacione con la falta de cumplimiento del mismo, deberá ser resuelto por medio del arreglo directo entre ambas partes, en caso de no tener resultados satisfactorios por el medio anterior, ambas partes se someten a la mediación de un tribunal arbitral, que estará integrado por tres miembros, nombrados uno por cada parte y un tercero por el Centro de Conciliación y Arbitraje  de la Cámara de Comercio e Industrias de Cortés. </w:t>
+        <w:t xml:space="preserve">: RESOLUCION DE CONFLICTOS cualquier controversia o reclamo que se origine del presente contrato o que se relacione con la falta de cumplimiento del mismo, </w:t>
+      </w:r>
+      <w:r>
+        <w:rPr>
+          <w:rFonts w:cstheme="minorHAnsi"/>
+        </w:rPr>
+        <w:t xml:space="preserve">deberá ser resuelto por medio del arreglo directo entre ambas partes, en caso de no tener resultados satisfactorios por el medio anterior, ambas partes se someten a la mediación de un tribunal arbitral, que estará integrado por tres miembros, nombrados uno por cada parte y un tercero por el Centro de Conciliación y Arbitraje  de la Cámara de Comercio e Industrias de Cortés. </w:t>
       </w:r>
       <w:r>
         <w:rPr>
@@ -1657,13 +1663,7 @@
         <w:rPr>
           <w:rFonts w:cstheme="minorHAnsi"/>
         </w:rPr>
-        <w:t xml:space="preserve">: Los comparecientes, en sus respectivos caracteres y representaciones, aceptan los derechos y obligaciones contenidos en el presente documento. Leído que fue íntegramente el presente contrato, es ratificado, y aprobado, por ambas partes y en fe de lo cual firman, </w:t>
-      </w:r>
-      <w:r>
-        <w:rPr>
-          <w:rFonts w:cstheme="minorHAnsi"/>
-        </w:rPr>
-        <w:t>en la Ciudad de</w:t>
+        <w:t>: Los comparecientes, en sus respectivos caracteres y representaciones, aceptan los derechos y obligaciones contenidos en el presente documento. Leído que fue íntegramente el presente contrato, es ratificado, y aprobado, por ambas partes y en fe de lo cual firman, en la Ciudad de</w:t>
       </w:r>
       <w:r>
         <w:rPr>
@@ -1684,28 +1684,33 @@
         <w:rPr>
           <w:rFonts w:cstheme="minorHAnsi"/>
         </w:rPr>
-        <w:t xml:space="preserve"> ${DEPARTAMENTO}</w:t>
-      </w:r>
-      <w:r>
-        <w:rPr>
-          <w:rFonts w:cstheme="minorHAnsi"/>
-        </w:rPr>
-        <w:t xml:space="preserve">, </w:t>
-      </w:r>
-    </w:p>
-    <w:p>
-      <w:pPr>
-        <w:pStyle w:val="Sinespaciado"/>
-        <w:jc w:val="both"/>
-        <w:rPr>
-          <w:rFonts w:cstheme="minorHAnsi"/>
-        </w:rPr>
-      </w:pPr>
-      <w:r>
-        <w:rPr>
-          <w:rFonts w:cstheme="minorHAnsi"/>
-        </w:rPr>
-        <w:t xml:space="preserve">a los </w:t>
+        <w:t xml:space="preserve"> ${DEPARTAMENTO</w:t>
+      </w:r>
+      <w:proofErr w:type="gramStart"/>
+      <w:r>
+        <w:rPr>
+          <w:rFonts w:cstheme="minorHAnsi"/>
+        </w:rPr>
+        <w:t>}</w:t>
+      </w:r>
+      <w:r>
+        <w:rPr>
+          <w:rFonts w:cstheme="minorHAnsi"/>
+        </w:rPr>
+        <w:t>,</w:t>
+      </w:r>
+      <w:r>
+        <w:rPr>
+          <w:rFonts w:cstheme="minorHAnsi"/>
+        </w:rPr>
+        <w:t>a</w:t>
+      </w:r>
+      <w:proofErr w:type="gramEnd"/>
+      <w:r>
+        <w:rPr>
+          <w:rFonts w:cstheme="minorHAnsi"/>
+        </w:rPr>
+        <w:t xml:space="preserve"> los </w:t>
       </w:r>
       <w:r>
         <w:t>${DIAS</w:t>

</xml_diff>

<commit_message>
Refactor vehicle sale contract templates to improve clarity and consistency in terms. Updated clauses regarding payment, warranty, and conflict resolution in the vehicle sale contracts for PJ, PN NULO, and PN. Ensured uniformity in language and structure across all documents.
</commit_message>
<xml_diff>
--- a/plantillas/venta_contrato_vehiculo_PJ_NULO_v2.docx
+++ b/plantillas/venta_contrato_vehiculo_PJ_NULO_v2.docx
@@ -1459,56 +1459,56 @@
         <w:rPr>
           <w:rFonts w:cstheme="minorHAnsi"/>
         </w:rPr>
-        <w:t xml:space="preserve"> Notificar </w:t>
+        <w:t xml:space="preserve"> Notificar inmediatamente por escrito o por cualquier medio a EL VENDEDOR dentro de las veinticuatro (24) horas siguientes de detectado el desperfecto </w:t>
+      </w:r>
+      <w:r>
+        <w:rPr>
+          <w:rFonts w:cstheme="minorHAnsi"/>
+          <w:b/>
+          <w:bCs/>
+        </w:rPr>
+        <w:t>b)</w:t>
+      </w:r>
+      <w:r>
+        <w:rPr>
+          <w:rFonts w:cstheme="minorHAnsi"/>
+        </w:rPr>
+        <w:t xml:space="preserve"> Abstenerse de realizar reparaciones en talleres no autorizados por EL VENDEDOR. </w:t>
+      </w:r>
+      <w:r>
+        <w:rPr>
+          <w:rFonts w:cstheme="minorHAnsi"/>
+          <w:b/>
+          <w:bCs/>
+        </w:rPr>
+        <w:t>c)</w:t>
+      </w:r>
+      <w:r>
+        <w:rPr>
+          <w:rFonts w:cstheme="minorHAnsi"/>
+        </w:rPr>
+        <w:t xml:space="preserve"> Presentar el vehículo en el taller designado por EL VENDEDOR para su evaluación </w:t>
+      </w:r>
+      <w:r>
+        <w:rPr>
+          <w:rFonts w:cstheme="minorHAnsi"/>
+          <w:b/>
+          <w:bCs/>
+        </w:rPr>
+        <w:t>d)</w:t>
+      </w:r>
+      <w:r>
+        <w:rPr>
+          <w:rFonts w:cstheme="minorHAnsi"/>
+        </w:rPr>
+        <w:t xml:space="preserve"> El incumplimiento de estas condiciones dejará </w:t>
       </w:r>
       <w:r>
         <w:rPr>
           <w:rFonts w:cstheme="minorHAnsi"/>
         </w:rPr>
         <w:lastRenderedPageBreak/>
-        <w:t xml:space="preserve">inmediatamente por escrito o por cualquier medio a EL VENDEDOR dentro de las veinticuatro (24) horas siguientes de detectado el desperfecto </w:t>
-      </w:r>
-      <w:r>
-        <w:rPr>
-          <w:rFonts w:cstheme="minorHAnsi"/>
-          <w:b/>
-          <w:bCs/>
-        </w:rPr>
-        <w:t>b)</w:t>
-      </w:r>
-      <w:r>
-        <w:rPr>
-          <w:rFonts w:cstheme="minorHAnsi"/>
-        </w:rPr>
-        <w:t xml:space="preserve"> Abstenerse de realizar reparaciones en talleres no autorizados por EL VENDEDOR. </w:t>
-      </w:r>
-      <w:r>
-        <w:rPr>
-          <w:rFonts w:cstheme="minorHAnsi"/>
-          <w:b/>
-          <w:bCs/>
-        </w:rPr>
-        <w:t>c)</w:t>
-      </w:r>
-      <w:r>
-        <w:rPr>
-          <w:rFonts w:cstheme="minorHAnsi"/>
-        </w:rPr>
-        <w:t xml:space="preserve"> Presentar el vehículo en el taller designado por EL VENDEDOR para su evaluación </w:t>
-      </w:r>
-      <w:r>
-        <w:rPr>
-          <w:rFonts w:cstheme="minorHAnsi"/>
-          <w:b/>
-          <w:bCs/>
-        </w:rPr>
-        <w:t>d)</w:t>
-      </w:r>
-      <w:r>
-        <w:rPr>
-          <w:rFonts w:cstheme="minorHAnsi"/>
-        </w:rPr>
-        <w:t xml:space="preserve"> El incumplimiento de estas condiciones dejará sin valor y efecto la garantía otorgada</w:t>
+        <w:t>sin valor y efecto la garantía otorgada</w:t>
       </w:r>
       <w:r>
         <w:rPr>
@@ -1642,7 +1642,13 @@
         <w:rPr>
           <w:rFonts w:cstheme="minorHAnsi"/>
         </w:rPr>
-        <w:t xml:space="preserve">: RESOLUCION DE CONFLICTOS cualquier controversia o reclamo que se origine del presente contrato o que se relacione con la falta de cumplimiento del mismo, deberá ser resuelto por medio del arreglo directo entre ambas partes, en caso de no tener resultados satisfactorios por el medio anterior, ambas partes se someten a la mediación de un tribunal arbitral, que estará integrado por tres miembros, nombrados uno por cada parte y un tercero por el Centro de Conciliación y Arbitraje  de la Cámara de Comercio e Industrias de Cortés. </w:t>
+        <w:t xml:space="preserve">: RESOLUCION DE CONFLICTOS cualquier controversia o reclamo que se origine del presente contrato o que se relacione con la falta de cumplimiento del mismo, </w:t>
+      </w:r>
+      <w:r>
+        <w:rPr>
+          <w:rFonts w:cstheme="minorHAnsi"/>
+        </w:rPr>
+        <w:t xml:space="preserve">deberá ser resuelto por medio del arreglo directo entre ambas partes, en caso de no tener resultados satisfactorios por el medio anterior, ambas partes se someten a la mediación de un tribunal arbitral, que estará integrado por tres miembros, nombrados uno por cada parte y un tercero por el Centro de Conciliación y Arbitraje  de la Cámara de Comercio e Industrias de Cortés. </w:t>
       </w:r>
       <w:r>
         <w:rPr>
@@ -1657,13 +1663,7 @@
         <w:rPr>
           <w:rFonts w:cstheme="minorHAnsi"/>
         </w:rPr>
-        <w:t xml:space="preserve">: Los comparecientes, en sus respectivos caracteres y representaciones, aceptan los derechos y obligaciones contenidos en el presente documento. Leído que fue íntegramente el presente contrato, es ratificado, y aprobado, por ambas partes y en fe de lo cual firman, </w:t>
-      </w:r>
-      <w:r>
-        <w:rPr>
-          <w:rFonts w:cstheme="minorHAnsi"/>
-        </w:rPr>
-        <w:t>en la Ciudad de</w:t>
+        <w:t>: Los comparecientes, en sus respectivos caracteres y representaciones, aceptan los derechos y obligaciones contenidos en el presente documento. Leído que fue íntegramente el presente contrato, es ratificado, y aprobado, por ambas partes y en fe de lo cual firman, en la Ciudad de</w:t>
       </w:r>
       <w:r>
         <w:rPr>
@@ -1684,28 +1684,33 @@
         <w:rPr>
           <w:rFonts w:cstheme="minorHAnsi"/>
         </w:rPr>
-        <w:t xml:space="preserve"> ${DEPARTAMENTO}</w:t>
-      </w:r>
-      <w:r>
-        <w:rPr>
-          <w:rFonts w:cstheme="minorHAnsi"/>
-        </w:rPr>
-        <w:t xml:space="preserve">, </w:t>
-      </w:r>
-    </w:p>
-    <w:p>
-      <w:pPr>
-        <w:pStyle w:val="Sinespaciado"/>
-        <w:jc w:val="both"/>
-        <w:rPr>
-          <w:rFonts w:cstheme="minorHAnsi"/>
-        </w:rPr>
-      </w:pPr>
-      <w:r>
-        <w:rPr>
-          <w:rFonts w:cstheme="minorHAnsi"/>
-        </w:rPr>
-        <w:t xml:space="preserve">a los </w:t>
+        <w:t xml:space="preserve"> ${DEPARTAMENTO</w:t>
+      </w:r>
+      <w:proofErr w:type="gramStart"/>
+      <w:r>
+        <w:rPr>
+          <w:rFonts w:cstheme="minorHAnsi"/>
+        </w:rPr>
+        <w:t>}</w:t>
+      </w:r>
+      <w:r>
+        <w:rPr>
+          <w:rFonts w:cstheme="minorHAnsi"/>
+        </w:rPr>
+        <w:t>,</w:t>
+      </w:r>
+      <w:r>
+        <w:rPr>
+          <w:rFonts w:cstheme="minorHAnsi"/>
+        </w:rPr>
+        <w:t>a</w:t>
+      </w:r>
+      <w:proofErr w:type="gramEnd"/>
+      <w:r>
+        <w:rPr>
+          <w:rFonts w:cstheme="minorHAnsi"/>
+        </w:rPr>
+        <w:t xml:space="preserve"> los </w:t>
       </w:r>
       <w:r>
         <w:t>${DIAS</w:t>
@@ -2065,7 +2070,7 @@
       <w:headerReference w:type="default" r:id="rId6"/>
       <w:footerReference w:type="default" r:id="rId7"/>
       <w:pgSz w:w="12240" w:h="15840" w:code="1"/>
-      <w:pgMar w:top="1701" w:right="720" w:bottom="1560" w:left="720" w:header="709" w:footer="709" w:gutter="0"/>
+      <w:pgMar w:top="851" w:right="720" w:bottom="1559" w:left="720" w:header="709" w:footer="709" w:gutter="0"/>
       <w:cols w:space="708"/>
       <w:docGrid w:linePitch="360"/>
     </w:sectPr>
@@ -2204,13 +2209,13 @@
         <w:noProof/>
       </w:rPr>
       <w:drawing>
-        <wp:anchor distT="0" distB="0" distL="114300" distR="114300" simplePos="0" relativeHeight="251658240" behindDoc="1" locked="0" layoutInCell="1" allowOverlap="1" wp14:anchorId="66A91AF4" wp14:editId="15F76157">
+        <wp:anchor distT="0" distB="0" distL="114300" distR="114300" simplePos="0" relativeHeight="251658240" behindDoc="1" locked="0" layoutInCell="1" allowOverlap="1" wp14:anchorId="66A91AF4" wp14:editId="44D83DE0">
           <wp:simplePos x="0" y="0"/>
-          <wp:positionH relativeFrom="column">
-            <wp:posOffset>5083175</wp:posOffset>
+          <wp:positionH relativeFrom="margin">
+            <wp:align>right</wp:align>
           </wp:positionH>
           <wp:positionV relativeFrom="paragraph">
-            <wp:posOffset>-245745</wp:posOffset>
+            <wp:posOffset>-372966</wp:posOffset>
           </wp:positionV>
           <wp:extent cx="1292203" cy="495300"/>
           <wp:effectExtent l="0" t="0" r="3810" b="0"/>

</xml_diff>